<commit_message>
Ch24 Bare Wrists: new chapter + review pass; wrist device renamed pane->terminal (Ch13/17/18/23/24); OG lineage decision logged
</commit_message>
<xml_diff>
--- a/manuscript/chapter-17-you-are-welcome.docx
+++ b/manuscript/chapter-17-you-are-welcome.docx
@@ -55,7 +55,7 @@
     </w:p>
     <w:p>
       <w:r>
-        <w:t>The monitor tower was between cycles, its corridors holding the thin evening population of technicians and off-duty staff. Daren walked through them the way a current moves through still water. A wrist pane dimmed. A lift arrived empty and held its doors a moment longer than its schedule allowed. A corridor sensor looked at him and recorded a maintenance interval instead. None of it required his attention anymore, and none of it received it.</w:t>
+        <w:t>The monitor tower was between cycles, its corridors holding the thin evening population of technicians and off-duty staff. Daren walked through them the way a current moves through still water. A wrist terminal dimmed. A lift arrived empty and held its doors a moment longer than its schedule allowed. A corridor sensor looked at him and recorded a maintenance interval instead. None of it required his attention anymore, and none of it received it.</w:t>
       </w:r>
     </w:p>
     <w:p>
@@ -70,7 +70,7 @@
     </w:p>
     <w:p>
       <w:r>
-        <w:t>Every terminal in the carriage ran the same routine on Daren that it ran on every other passenger: a quiet identity query, answered in milliseconds, logged and forgotten. The bracelet answered each one. It never withheld a reply — an unanswered query was an anomaly, and anomalies were reported. It answered each instrument in its own dialect: to the clerk's terminal, an authorization class that made him none of her business; to the responders' duty catalog, a status that filed him as cleared, logged, and already someone else's responsibility; to the family's modest panes, nothing worth underlining at all. Each device accepted its answer, closed its query, and told its owner, in the wordless way instruments speak, that the carriage contained nothing requiring attention.</w:t>
+        <w:t>Every terminal in the carriage ran the same routine on Daren that it ran on every other passenger: a quiet identity query, answered in milliseconds, logged and forgotten. The bracelet answered each one. It never withheld a reply — an unanswered query was an anomaly, and anomalies were reported. It answered each instrument in its own dialect: to the clerk's terminal, an authorization class that made him none of her business; to the responders' duty catalog, a status that filed him as cleared, logged, and already someone else's responsibility; to the family's modest terminals, nothing worth underlining at all. Each device accepted its answer, closed its query, and told its owner, in the wordless way instruments speak, that the carriage contained nothing requiring attention.</w:t>
       </w:r>
     </w:p>
     <w:p>
@@ -80,17 +80,17 @@
     </w:p>
     <w:p>
       <w:r>
-        <w:t>The family's cat saw him. It rode in a mesh carrier on the daughter's lap, and somewhere over the open dark it stopped licking its paw and fixed its eyes on the far end of the carriage. No terminal spoke for a cat. Nothing ranked what it was permitted to notice. It had only its eyes and its nose, and both reported a man where every instrument in the carriage reported nothing. Its ears went flat. Its body dropped low in the carrier, and it stared without blinking for the whole length of the crossing. The daughter tapped the mesh and whispered to it. Her mother glanced down the carriage, saw a passenger standing at the dark end — plainly there, plainly visible — consulted her pane, found no flag, no rank, no reason, and felt her attention slide off him with nothing to hold it. She was not blind. She had merely spent her whole life letting the instruments tell her which of the things she saw deserved a second look, and this one, the pane said, deserved none.</w:t>
+        <w:t>The family's cat saw him. It rode in a mesh carrier on the daughter's lap, and somewhere over the open dark it stopped licking its paw and fixed its eyes on the far end of the carriage. No terminal spoke for a cat. Nothing ranked what it was permitted to notice. It had only its eyes and its nose, and both reported a man where every instrument in the carriage reported nothing. Its ears went flat. Its body dropped low in the carrier, and it stared without blinking for the whole length of the crossing. The daughter tapped the mesh and whispered to it. Her mother glanced down the carriage, saw a passenger standing at the dark end — plainly there, plainly visible — consulted her terminal, found no flag, no rank, no reason, and felt her attention slide off him with nothing to hold it. She was not blind. She had merely spent her whole life letting the instruments tell her which of the things she saw deserved a second look, and this one, the terminal said, deserved none.</w:t>
       </w:r>
     </w:p>
     <w:p>
       <w:r>
-        <w:t>The cat had no pane. It simply kept staring — and Daren, who had long since stopped noticing the people who failed to notice him, noticed the cat.</w:t>
+        <w:t>The cat had no terminal. It simply kept staring — and Daren, who had long since stopped noticing the people who failed to notice him, noticed the cat.</w:t>
       </w:r>
     </w:p>
     <w:p>
       <w:r>
-        <w:t>That was the bracelet's true reach, and Daren had stopped marveling at it. It did not hide him from people. It answered for him to the machines that people had trusted with their noticing — every gate, every pane, every duty catalog, one negotiation at a time, thousands of times an hour, without one error. The city had agreed, years before Daren was born, to see through its instruments. Whoever commanded the instruments decided what the city saw.</w:t>
+        <w:t>That was the bracelet's true reach, and Daren had stopped marveling at it. It did not hide him from people. It answered for him to the machines that people had trusted with their noticing — every gate, every terminal, every duty catalog, one negotiation at a time, thousands of times an hour, without one error. The city had agreed, years before Daren was born, to see through its instruments. Whoever commanded the instruments decided what the city saw.</w:t>
       </w:r>
     </w:p>
     <w:p>
@@ -125,7 +125,7 @@
     </w:p>
     <w:p>
       <w:r>
-        <w:t>He did not take part in the negotiation. The bracelet conducted all of it. The entry colonnade's scanners reached for him and were met, matched, and satisfied before their queries finished forming. A route marker shifted one shade toward amber and back. A desk warden's pane refreshed itself for no reason the warden would ever identify. Ahead of him, a pair of late-working representatives turned out of his path mid-conversation without breaking the rhythm of their argument, each believing the other had drifted.</w:t>
+        <w:t>He did not take part in the negotiation. The bracelet conducted all of it. The entry colonnade's scanners reached for him and were met, matched, and satisfied before their queries finished forming. A route marker shifted one shade toward amber and back. A desk warden's terminal refreshed itself for no reason the warden would ever identify. Ahead of him, a pair of late-working representatives turned out of his path mid-conversation without breaking the rhythm of their argument, each believing the other had drifted.</w:t>
       </w:r>
     </w:p>
     <w:p>
@@ -185,7 +185,7 @@
     </w:p>
     <w:p>
       <w:r>
-        <w:t>So he broke the first rule by coming, and the second by telling no one. The third he carried in his pocket as he walked into the hall — his wrist pane, set to passive record, a small lawful rebellion against an unlawful evening. If he could not attend the meeting as Chanakya wished, he would at least bring Chanakya's one commandment with him: keep the record.</w:t>
+        <w:t>So he broke the first rule by coming, and the second by telling no one. The third he carried in his pocket as he walked into the hall — his wrist terminal, set to passive record, a small lawful rebellion against an unlawful evening. If he could not attend the meeting as Chanakya wished, he would at least bring Chanakya's one commandment with him: keep the record.</w:t>
       </w:r>
     </w:p>
     <w:p>
@@ -205,7 +205,7 @@
     </w:p>
     <w:p>
       <w:r>
-        <w:t>Ravi's wrist pane died with the last of them.</w:t>
+        <w:t>Ravi's wrist terminal died with the last of them.</w:t>
       </w:r>
     </w:p>
     <w:p>
@@ -350,7 +350,7 @@
     </w:p>
     <w:p>
       <w:r>
-        <w:t>Ravi had believed, until that sentence, that he was managing the evening. He had catalogued the dark lamps, the dead pane, the assembled voice; he had kept his reasoning in front of him like a lamp of his own. The sentence put it out. The match had been the honor of his life. He had carried it as proof that somewhere in Chanakya's machinery of records and recirculated disputes, merit could still surface on its own. He had been selected the way a file is selected. Pulled, read, and assessed by a hand that had already decided what it was looking for.</w:t>
+        <w:t>Ravi had believed, until that sentence, that he was managing the evening. He had catalogued the dark lamps, the dead terminal, the assembled voice; he had kept his reasoning in front of him like a lamp of his own. The sentence put it out. The match had been the honor of his life. He had carried it as proof that somewhere in Chanakya's machinery of records and recirculated disputes, merit could still surface on its own. He had been selected the way a file is selected. Pulled, read, and assessed by a hand that had already decided what it was looking for.</w:t>
       </w:r>
     </w:p>
     <w:p>
@@ -535,7 +535,7 @@
     </w:p>
     <w:p>
       <w:r>
-        <w:t>They returned the way they had gone — one by one along the walls, the amber watch reopening its eyes in sequence — and with them the room resumed being what it had always been: the East Policy Conservatory, keeper of every word, where nothing was ever lost. Ravi's wrist pane woke against his arm and began recording an empty hall.</w:t>
+        <w:t>They returned the way they had gone — one by one along the walls, the amber watch reopening its eyes in sequence — and with them the room resumed being what it had always been: the East Policy Conservatory, keeper of every word, where nothing was ever lost. Ravi's wrist terminal woke against his arm and began recording an empty hall.</w:t>
       </w:r>
     </w:p>
     <w:p>

</xml_diff>